<commit_message>
Add measured multi-GPU index sharding (3x Tesla P40) to the paper
The node's raw outputs (check_env, shard_bench) are kept unchanged in
results/multi_gpu/. multi_gpu_scaling.py derives strong and weak scaling,
dispatch/merge overhead and an idle-power estimate into
results/multi_gpu_scaling.json.

- New tables multi_gpu_scaling and hardware_multigpu, and a two-panel
  figure (latency and throughput against GPU count).
- Abstract, Introduction, Method, Setup, Results, Limitations,
  Conclusion, response letter and SUMMARY now report measured sharding
  instead of "emulated". Single-GPU emulation is still described for the
  4090, and the measurements validate it.
- Energy: node energy per query falls with more GPUs only because idle
  GPUs draw ~51 W each. Active energy is unchanged, and the text says so.
- shard_bench/README: native fp16 is slow on Pascal, but GEMM is not.
</commit_message>
<xml_diff>
--- a/CAVR/revision/paper_out/letter/response_to_reviewers.docx
+++ b/CAVR/revision/paper_out/letter/response_to_reviewers.docx
@@ -67,7 +67,7 @@
           <w:b w:val="0"/>
           <w:i w:val="0"/>
         </w:rPr>
-        <w:t>Every answer path (text, visual and hybrid) is now run on every one of the 8,150 DocVQA and InfographicVQA validation questions, with real BM25 and ColPali retrieval and one local generator (Qwen2.5-VL-7B-Instruct). Answer quality (ANLS and exact match), GPU-seconds, energy and latency are measured per query on one GeForce RTX 4090. Route labels now come from measured outcomes rather than a keyword rule, and routers are evaluated on held-out pages of five page-grouped splits. As the editor requested, the paper is now framed as a GPU resource-scheduling problem, with new experiments on serving capacity under load, the GPUs needed at a latency target and visual-index scaling.</w:t>
+        <w:t>Every answer path (text, visual and hybrid) is now run on every one of the 8,150 DocVQA and InfographicVQA validation questions, with real BM25 and ColPali retrieval and one local generator (Qwen2.5-VL-7B-Instruct). Answer quality (ANLS and exact match), GPU-seconds, energy and latency are measured per query on one GeForce RTX 4090. Route labels now come from measured outcomes rather than a keyword rule, and routers are evaluated on held-out pages of five page-grouped splits. As the editor requested, the paper is now framed as a GPU resource-scheduling problem, with new experiments on serving capacity under load, the GPUs needed at a latency target and visual-index scaling, including index sharding measured on three GPUs.</w:t>
       </w:r>
     </w:p>
     <w:p>
@@ -644,7 +644,7 @@
           <w:b w:val="0"/>
           <w:i w:val="0"/>
         </w:rPr>
-        <w:t>Late-interaction visual retrieval stores 1,031 vectors per page, so the index grows with the corpus: at 100k pages it needs 24.6 GiB, more than our 24 GiB GPU holds, and a million pages (about 246 GiB) would exceed any single accelerator. Such an index must be streamed from host memory (1,044 ms per query on our hardware), pooled (recall@1 drops from 0.577 to 0.525) or sharded. We state that routing saves generation compute rather than index memory.</w:t>
+        <w:t>Late-interaction visual retrieval stores 1,031 vectors per page, so the index grows with the corpus: at 100k pages it needs 24.6 GiB, more than our 24 GiB GPU holds, and a million pages (about 246 GiB) would exceed any single accelerator. Such an index must be streamed from host memory (1,044 ms per query on our hardware), pooled (recall@1 drops from 0.577 to 0.525) or sharded. We now measure sharding on a node with three Tesla P40 GPUs. Sharded search returns the same top page as one GPU; a 50k-page index is searched in 327, 164 and 109 ms on one, two and three GPUs (parallel efficiency 99.8%); and a 150k-page index (36.9 GiB, more than any one of these GPUs holds) is searched in 328 ms, as fast as 50k pages on one GPU. We state that routing saves generation compute rather than index memory.</w:t>
       </w:r>
     </w:p>
     <w:p>
@@ -656,7 +656,7 @@
           <w:b w:val="0"/>
           <w:i w:val="0"/>
         </w:rPr>
-        <w:t xml:space="preserve">New material: a hardware table, energy per query from NVML, router throughput up to batch 1,024, serving capacity and GPUs needed per policy, visual-index latency from 1k to 100k pages, and serial versus speculative escalation. The method figure was redrawn as the pipeline actually built, including its deployment on a GPU pool. We are explicit about scale: all measurements use one GPU, capacity beyond it is simulated from measured service times, multi-GPU sharding is emulated, and larger indexes are built from replicated page embeddings. </w:t>
+        <w:t xml:space="preserve">New material: a hardware table for each machine, energy per query from NVML, router throughput up to batch 1,024, serving capacity and GPUs needed per policy, visual-index latency from 1k to 100k pages, index sharding measured on one to three GPUs (strong and weak scaling, with energy), and serial versus speculative escalation. The method figure was redrawn as the pipeline actually built, including its deployment on a GPU pool. We are explicit about scale: routing and generation are measured on one GPU, capacity beyond it is simulated from measured service times, sharding is measured for retrieval only on older GPUs whose absolute times do not transfer to the workstation, and larger indexes are built from replicated page embeddings. </w:t>
       </w:r>
       <w:r>
         <w:rPr>
@@ -710,7 +710,7 @@
           <w:b w:val="0"/>
           <w:i w:val="0"/>
         </w:rPr>
-        <w:t>Every number now comes from one cached run of every path on every query, and tables and figures are generated from the results files. The withdrawn claims are listed above. Policy results are means and standard deviations over five page-grouped splits, with McNemar and paired-bootstrap tests, and every comparison states its cost. A new Limitations subsection covers the single GPU, simulated rather than live traffic, escalation latencies computed from measured per-stage times, synthetic index scaling, emulated sharding, GPU-only energy, text-only queries, and the 35% of queries that no path answers.</w:t>
+        <w:t>Every number now comes from one cached run of every path on every query, and tables and figures are generated from the results files. The withdrawn claims are listed above. Policy results are means and standard deviations over five page-grouped splits, with McNemar and paired-bootstrap tests, and every comparison states its cost. A new Limitations subsection covers the single GPU, simulated rather than live traffic, escalation latencies computed from measured per-stage times, synthetic index scaling, sharding measured on older GPUs for retrieval only, GPU-only energy, text-only queries, and the 35% of queries that no path answers.</w:t>
       </w:r>
     </w:p>
     <w:p>

</xml_diff>

<commit_message>
Response letter: resolve author actions that are already done
Related-work citations (verified bibliography, b6f7a3b), the load-adaptive lambda experiment (18f867e),
the "two orders of magnitude" phrase (no longer in the manuscript) and the reference audit (bibliography
rebuilt from verified records, Table 1 removed) were still marked [AUTHOR ACTION]. Replies now state what
was done; the out-of-distribution row reports the held-out confirmation set. Same edits made in the
shared response-letter doc (rev 36).
</commit_message>
<xml_diff>
--- a/CAVR/revision/paper_out/letter/response_to_reviewers.docx
+++ b/CAVR/revision/paper_out/letter/response_to_reviewers.docx
@@ -647,15 +647,7 @@
           <w:b w:val="0"/>
           <w:i w:val="0"/>
         </w:rPr>
-        <w:t xml:space="preserve">New material: a hardware table for each machine, energy per query from NVML, router throughput up to batch 1,024, serving capacity and GPUs needed per policy, live serving with vLLM on two A10 GPUs, visual-index latency from 1k to 100k pages, an index of a million pages streamed from host memory, index sharding measured on two multi-GPU nodes (strong and weak scaling, with energy), and serial versus speculative escalation. The method figure was redrawn as the pipeline actually built, including its deployment on a GPU pool. We are explicit about scale: routing and generation are measured on one GPU, capacity beyond it is simulated from measured service times and checked against live serving on two A10 GPUs, sharding is measured for retrieval only, on server nodes with older and data-centre GPUs whose absolute times do not transfer to the workstation, and larger indexes are built from replicated page embeddings. </w:t>
-      </w:r>
-      <w:r>
-        <w:rPr>
-          <w:b w:val="0"/>
-          <w:i w:val="0"/>
-          <w:color w:val="C01F1F"/>
-        </w:rPr>
-        <w:t>[AUTHOR ACTION: write and verify the related-work citations on inference serving and late-interaction retrieval.]</w:t>
+        <w:t>New material: a hardware table for each machine, energy per query from NVML, router throughput up to batch 1,024, serving capacity and GPUs needed per policy, live serving with vLLM on two A10 GPUs, visual-index latency from 1k to 100k pages, an index of a million pages streamed from host memory, index sharding measured on two multi-GPU nodes (strong and weak scaling, with energy), and serial versus speculative escalation. The method figure was redrawn as the pipeline actually built, including its deployment on a GPU pool. We are explicit about scale: routing and generation are measured on one GPU, capacity beyond it is simulated from measured service times and checked against live serving on two A10 GPUs, sharding is measured for retrieval only, on server nodes with older and data-centre GPUs whose absolute times do not transfer to the workstation, and larger indexes are built from replicated page embeddings. A new Related work section covers visual-document retrieval, adaptive retrieval and model routing, efficient late-interaction and vector search, and inference serving; every reference was checked against its DOI, arXiv, OpenReview or publisher record.</w:t>
       </w:r>
     </w:p>
     <w:p>
@@ -895,15 +887,7 @@
           <w:b w:val="0"/>
           <w:i w:val="0"/>
         </w:rPr>
-        <w:t xml:space="preserve"> takes the cost weight λ as a run-time input. One trained router therefore covers a range of budgets: sweeping λ from 1 to 0 moves CAVR-CE from ANLS 0.502 at 0.56 GPU-s to 0.564 at 0.84 GPU-s (mean over splits). A cost–quality frontier figure and a table of operating points with their serving capacity were added. Adapting λ to load is described as a deployment option but not evaluated. </w:t>
-      </w:r>
-      <w:r>
-        <w:rPr>
-          <w:b w:val="0"/>
-          <w:i w:val="0"/>
-          <w:color w:val="C01F1F"/>
-        </w:rPr>
-        <w:t>[AUTHOR ACTION: decide whether to add a load-adaptive λ experiment.]</w:t>
+        <w:t xml:space="preserve"> takes the cost weight λ as a run-time input. One trained router therefore covers a range of budgets: sweeping λ from 1 to 0 moves CAVR-CE from ANLS 0.502 at 0.56 GPU-s to 0.564 at 0.84 GPU-s (mean over splits). A cost–quality frontier figure and a table of operating points with their serving capacity were added. We also added a load-adaptive experiment. On a fixed pool of 74 GPUs under bursts alternating between 80 and 140 queries/s, a controller that raises λ when the oldest queued request has waited too long serves 80.1% of requests within 2 s, against 77.5% at the fixed validation-chosen λ, at almost the same ANLS (0.559 vs 0.560); a fixed λ = 0.2 reaches 88.3% at ANLS 0.551. The gain is small because in our simulator overload appears mainly as larger batches rather than long queues, so a better overload signal is left as future work, and the paper says so.</w:t>
       </w:r>
     </w:p>
     <w:p>
@@ -1305,7 +1289,7 @@
           <w:b w:val="0"/>
           <w:i w:val="0"/>
         </w:rPr>
-        <w:t xml:space="preserve">Table 5 is removed, and targets are no longer reported. The sentence with "79" was removed with the withdrawn results. Router overhead is now reported as measured, 11.7 ms for CAVR and 24.8 ms for CAVR-CE per query. "Production-ready" is now "deployable system design". </w:t>
+        <w:t xml:space="preserve">Table 5 is removed, and targets are no longer reported. The sentence with "79" was removed with the withdrawn results. Router overhead is now reported as measured, 11.7 ms for CAVR and 24.8 ms for CAVR-CE per query. "Production-ready" is now "deployable system design". The phrase "two orders of magnitude" no longer appears in the manuscript. </w:t>
       </w:r>
       <w:r>
         <w:rPr>
@@ -1313,7 +1297,7 @@
           <w:i w:val="0"/>
           <w:color w:val="C01F1F"/>
         </w:rPr>
-        <w:t>[AUTHOR ACTION: remove "two orders of magnitude" wherever it remains, complete a full copy-edit pass, and address any further comments in Reviewer 2's attachment.]</w:t>
+        <w:t>[AUTHOR ACTION: complete a full copy-edit pass, and address any further comments in Reviewer 2's attachment.]</w:t>
       </w:r>
     </w:p>
     <w:p>
@@ -1610,9 +1594,8 @@
         <w:rPr>
           <w:b w:val="0"/>
           <w:i w:val="0"/>
-          <w:color w:val="C01F1F"/>
         </w:rPr>
-        <w:t>[AUTHOR ACTION: audit every reference against its DOI or arXiv page; fix references 9 and 29, remove duplicates, correct authors and venues, and remove any entry that cannot be found. Rebuild Table 1 afterwards, because RouteLLM and FrugalGPT do model cost.]</w:t>
+        <w:t>We agree, and rebuilt the bibliography from scratch rather than patching the submitted list. Each of the 39 references cited in the revised paper was checked against its Crossref record (by DOI), arXiv, OpenAlex, OpenReview or publisher page, and its authors, venue and year are taken from that record; the verification record is released with the code. No entry was copied from the submitted list, including [9], [29] and the duplicates; works cited again were re-entered from their verified records. The submitted comparison table (Table 1) is removed, and the new Related work section describes FrugalGPT, Hybrid LLM and RouteLLM as cost-aware routers whose threshold sets the cost–quality trade-off at run time.</w:t>
       </w:r>
     </w:p>
     <w:p>

</xml_diff>